<commit_message>
feat(day14-15): 20+ sample conversation flows, audit logging, risk matrix & final submission polish (Author: SATHVIKA BOINA)
</commit_message>
<xml_diff>
--- a/ARCHITECTURE.docx
+++ b/ARCHITECTURE.docx
@@ -13,6 +13,30 @@
           <w:color w:val="1A365D"/>
         </w:rPr>
         <w:t>NexBank Agentic AI - System Architecture &amp; Technical Specifications</w:t>
+      </w:r>
+    </w:p>
+    <w:p>
+      <w:pPr>
+        <w:spacing w:after="80" w:line="276" w:lineRule="auto"/>
+      </w:pPr>
+      <w:r>
+        <w:rPr>
+          <w:rFonts w:ascii="Segoe UI" w:hAnsi="Segoe UI"/>
+          <w:sz w:val="21"/>
+        </w:rPr>
+        <w:t xml:space="preserve">**Author / Conversational AI Architect**: SATHVIKA BOINA  </w:t>
+      </w:r>
+    </w:p>
+    <w:p>
+      <w:pPr>
+        <w:spacing w:after="80" w:line="276" w:lineRule="auto"/>
+      </w:pPr>
+      <w:r>
+        <w:rPr>
+          <w:rFonts w:ascii="Segoe UI" w:hAnsi="Segoe UI"/>
+          <w:sz w:val="21"/>
+        </w:rPr>
+        <w:t xml:space="preserve">**Organization**: NexBank Digital Banking Platform  </w:t>
       </w:r>
     </w:p>
     <w:p>

</xml_diff>